<commit_message>
maybe fully done? probably not..
</commit_message>
<xml_diff>
--- a/output/writing/DissertationChapter/Ch1_figs&refs.docx
+++ b/output/writing/DissertationChapter/Ch1_figs&refs.docx
@@ -1097,6 +1097,7 @@
       </w:r>
       <w:r>
         <w:rPr>
+          <w:noProof/>
           <w:sz w:val="20"/>
           <w:szCs w:val="20"/>
         </w:rPr>
@@ -1181,25 +1182,7 @@
           <w:sz w:val="20"/>
           <w:szCs w:val="20"/>
         </w:rPr>
-        <w:t>‘</w:t>
-      </w:r>
-      <w:r>
-        <w:rPr>
-          <w:i/>
-          <w:iCs/>
-          <w:sz w:val="20"/>
-          <w:szCs w:val="20"/>
-        </w:rPr>
-        <w:t>north southeast (outside)</w:t>
-      </w:r>
-      <w:r>
-        <w:rPr>
-          <w:i/>
-          <w:iCs/>
-          <w:sz w:val="20"/>
-          <w:szCs w:val="20"/>
-        </w:rPr>
-        <w:t>’</w:t>
+        <w:t>‘north southeast (outside)’</w:t>
       </w:r>
       <w:r>
         <w:rPr>
@@ -1319,25 +1302,7 @@
           <w:sz w:val="20"/>
           <w:szCs w:val="20"/>
         </w:rPr>
-        <w:t>2</w:t>
-      </w:r>
-      <w:r>
-        <w:rPr>
-          <w:i/>
-          <w:iCs/>
-          <w:sz w:val="20"/>
-          <w:szCs w:val="20"/>
-        </w:rPr>
-        <w:t xml:space="preserve">: </w:t>
-      </w:r>
-      <w:r>
-        <w:rPr>
-          <w:i/>
-          <w:iCs/>
-          <w:sz w:val="20"/>
-          <w:szCs w:val="20"/>
-        </w:rPr>
-        <w:t>Event studies evaluating the effect of Indian River on pink salmon abundances during pre-treatment periods. Parallel trends assumption holds in all cases except for even-year runs prior to 1980. It is necessary to construct a synthetic control group for this model.</w:t>
+        <w:t>2: Event studies evaluating the effect of Indian River on pink salmon abundances during pre-treatment periods. Parallel trends assumption holds in all cases except for even-year runs prior to 1980. It is necessary to construct a synthetic control group for this model.</w:t>
       </w:r>
     </w:p>
     <w:p>
@@ -1359,10 +1324,10 @@
         </w:rPr>
         <w:lastRenderedPageBreak/>
         <w:drawing>
-          <wp:inline distT="0" distB="0" distL="0" distR="0" wp14:anchorId="4328B6B9" wp14:editId="32E48A22">
-            <wp:extent cx="5934075" cy="5353050"/>
+          <wp:inline distT="0" distB="0" distL="0" distR="0" wp14:anchorId="5DCAB4DC" wp14:editId="29346369">
+            <wp:extent cx="5934075" cy="4933950"/>
             <wp:effectExtent l="0" t="0" r="9525" b="0"/>
-            <wp:docPr id="1631591186" name="Picture 5"/>
+            <wp:docPr id="871421284" name="Picture 1"/>
             <wp:cNvGraphicFramePr>
               <a:graphicFrameLocks xmlns:a="http://schemas.openxmlformats.org/drawingml/2006/main" noChangeAspect="1"/>
             </wp:cNvGraphicFramePr>
@@ -1370,7 +1335,7 @@
               <a:graphicData uri="http://schemas.openxmlformats.org/drawingml/2006/picture">
                 <pic:pic xmlns:pic="http://schemas.openxmlformats.org/drawingml/2006/picture">
                   <pic:nvPicPr>
-                    <pic:cNvPr id="0" name="Picture 5"/>
+                    <pic:cNvPr id="0" name="Picture 1"/>
                     <pic:cNvPicPr>
                       <a:picLocks noChangeAspect="1" noChangeArrowheads="1"/>
                     </pic:cNvPicPr>
@@ -1391,7 +1356,7 @@
                   <pic:spPr bwMode="auto">
                     <a:xfrm>
                       <a:off x="0" y="0"/>
-                      <a:ext cx="5934075" cy="5353050"/>
+                      <a:ext cx="5934075" cy="4933950"/>
                     </a:xfrm>
                     <a:prstGeom prst="rect">
                       <a:avLst/>
@@ -1672,8 +1637,17 @@
           <w:i/>
           <w:iCs/>
         </w:rPr>
-        <w:t>Oncorhynchus gorbuscha</w:t>
-      </w:r>
+        <w:t xml:space="preserve">Oncorhynchus </w:t>
+      </w:r>
+      <w:proofErr w:type="spellStart"/>
+      <w:r>
+        <w:rPr>
+          <w:i/>
+          <w:iCs/>
+        </w:rPr>
+        <w:t>gorbuscha</w:t>
+      </w:r>
+      <w:proofErr w:type="spellEnd"/>
       <w:r>
         <w:t xml:space="preserve">) in an Alaskan stream. </w:t>
       </w:r>
@@ -1690,7 +1664,15 @@
         <w:ind w:left="720" w:hanging="720"/>
       </w:pPr>
       <w:r>
-        <w:t xml:space="preserve">Miller, K. M., S. J. Perles, J. P. Schmit, E. R. Matthews, A. S. Weed, J. A. Comiskey, M. R. Marshall, P. Nelson, N. A. Fisichelli. 2023. </w:t>
+        <w:t xml:space="preserve">Miller, K. M., S. J. Perles, J. P. Schmit, E. R. Matthews, A. S. Weed, J. A. Comiskey, M. R. Marshall, P. Nelson, N. A. </w:t>
+      </w:r>
+      <w:proofErr w:type="spellStart"/>
+      <w:r>
+        <w:t>Fisichelli</w:t>
+      </w:r>
+      <w:proofErr w:type="spellEnd"/>
+      <w:r>
+        <w:t xml:space="preserve">. 2023. </w:t>
       </w:r>
       <w:r>
         <w:t>Overabundant deer and invasive plants drive widespread regeneration debt in eastern United States national parks.</w:t>
@@ -1718,7 +1700,15 @@
         <w:ind w:left="720" w:hanging="720"/>
       </w:pPr>
       <w:r>
-        <w:t xml:space="preserve">Moore, J. H., L. Gibson, Z. Amir, W. Chanthorn, A. H. Ahmad, P. A. Jansen, C. P. Mendes, M. Onuma, C. A. Peres, M. S. Luskin. 2023. The rise of hyperabundant native generalists threatens both humans and nature. </w:t>
+        <w:t xml:space="preserve">Moore, J. H., L. Gibson, Z. Amir, W. </w:t>
+      </w:r>
+      <w:proofErr w:type="spellStart"/>
+      <w:r>
+        <w:t>Chanthorn</w:t>
+      </w:r>
+      <w:proofErr w:type="spellEnd"/>
+      <w:r>
+        <w:t xml:space="preserve">, A. H. Ahmad, P. A. Jansen, C. P. Mendes, M. Onuma, C. A. Peres, M. S. Luskin. 2023. The rise of hyperabundant native generalists threatens both humans and nature. </w:t>
       </w:r>
       <w:r>
         <w:rPr>
@@ -1807,8 +1797,13 @@
         <w:spacing w:line="240" w:lineRule="auto"/>
         <w:ind w:left="720" w:hanging="720"/>
       </w:pPr>
-      <w:r>
-        <w:t xml:space="preserve">Sambaraju, K. R., D. W. Goodman. 2021. Mountain pine beetle: an example of a climate-driven eruptive insect impacting conifer forest ecosystems. </w:t>
+      <w:proofErr w:type="spellStart"/>
+      <w:r>
+        <w:t>Sambaraju</w:t>
+      </w:r>
+      <w:proofErr w:type="spellEnd"/>
+      <w:r>
+        <w:t xml:space="preserve">, K. R., D. W. Goodman. 2021. Mountain pine beetle: an example of a climate-driven eruptive insect impacting conifer forest ecosystems. </w:t>
       </w:r>
       <w:r>
         <w:rPr>
@@ -1872,7 +1867,15 @@
         <w:ind w:left="720" w:hanging="720"/>
       </w:pPr>
       <w:r>
-        <w:t xml:space="preserve">Sergeant, C. J., J. R. Bellmore, R. A. Bellmore, J. A. Falke, F. J. Mueter, and P. A. H. Westley. 2023. Hypoxia vulnerability in the salmon watersheds of Southeast Alaska. </w:t>
+        <w:t xml:space="preserve">Sergeant, C. J., J. R. Bellmore, R. A. Bellmore, J. A. Falke, F. J. </w:t>
+      </w:r>
+      <w:proofErr w:type="spellStart"/>
+      <w:r>
+        <w:t>Mueter</w:t>
+      </w:r>
+      <w:proofErr w:type="spellEnd"/>
+      <w:r>
+        <w:t xml:space="preserve">, and P. A. H. Westley. 2023. Hypoxia vulnerability in the salmon watersheds of Southeast Alaska. </w:t>
       </w:r>
       <w:r>
         <w:rPr>
@@ -1900,8 +1903,13 @@
           <w:iCs/>
         </w:rPr>
       </w:pPr>
-      <w:r>
-        <w:t xml:space="preserve">Stopha, M. 2015. </w:t>
+      <w:proofErr w:type="spellStart"/>
+      <w:r>
+        <w:t>Stopha</w:t>
+      </w:r>
+      <w:proofErr w:type="spellEnd"/>
+      <w:r>
+        <w:t xml:space="preserve">, M. 2015. </w:t>
       </w:r>
       <w:r>
         <w:rPr>
@@ -1973,7 +1981,15 @@
         <w:t xml:space="preserve">Van Alen, B. W. 2000. Status and Stewardship of Salmon Stocks in Southeast Alaska. In E. E. Knudsen, Steward, C. R., MacDonald, D. D., Williams, J. E., Reiser, D. W. </w:t>
       </w:r>
       <w:r>
-        <w:t>Sustainable Fisheries Managemnt – Pacific Salmon,</w:t>
+        <w:t xml:space="preserve">Sustainable Fisheries </w:t>
+      </w:r>
+      <w:proofErr w:type="spellStart"/>
+      <w:r>
+        <w:t>Managemnt</w:t>
+      </w:r>
+      <w:proofErr w:type="spellEnd"/>
+      <w:r>
+        <w:t xml:space="preserve"> – Pacific Salmon,</w:t>
       </w:r>
       <w:r>
         <w:t xml:space="preserve"> 161-193. Lewis Publishers.</w:t>

</xml_diff>